<commit_message>
Anonimizar referencias privadas del proyecto
</commit_message>
<xml_diff>
--- a/1 - Estado del Arte/PV_opt_MMA.docx
+++ b/1 - Estado del Arte/PV_opt_MMA.docx
@@ -36,7 +36,7 @@
             <w:szCs w:val="24"/>
             <w:lang w:val="es-ES"/>
           </w:rPr>
-          <w:t>DATAWiSE Deliverable T8.2 v1.2_CTC.pdf</w:t>
+          <w:t>DATAWiSE Deliverable T8.2 v1.2_ANON.pdf</w:t>
         </w:r>
       </w:hyperlink>
       <w:r>
@@ -74,7 +74,7 @@
             <w:szCs w:val="24"/>
             <w:lang w:val="es-ES"/>
           </w:rPr>
-          <w:t>DATAWiSE Deliverable T8.3 v0.2_CTC.pdf</w:t>
+          <w:t>DATAWiSE Deliverable T8.3 v0.2_ANON.pdf</w:t>
         </w:r>
       </w:hyperlink>
       <w:r>

</xml_diff>